<commit_message>
Update final report cover for end-of-term submission
</commit_message>
<xml_diff>
--- a/reports/PhamDangQuang_final.docx
+++ b/reports/PhamDangQuang_final.docx
@@ -170,7 +170,7 @@
           <w:b/>
           <w:sz w:val="34"/>
         </w:rPr>
-        <w:t>ĐỀ CƯƠNG BÁO CÁO THỰC HÀNH GIỮA KỲ</w:t>
+        <w:t>BÁO CÁO TIỂU LUẬN CUỐI KỲ</w:t>
       </w:r>
     </w:p>
     <w:p>
@@ -406,7 +406,7 @@
         <w:rPr>
           <w:noProof/>
         </w:rPr>
-        <w:instrText xml:space="preserve"> PAGEREF _Toc242131867 \h </w:instrText>
+        <w:instrText xml:space="preserve"> PAGEREF _Toc242132795 \h </w:instrText>
       </w:r>
       <w:r>
         <w:rPr>
@@ -466,7 +466,7 @@
         <w:rPr>
           <w:noProof/>
         </w:rPr>
-        <w:instrText xml:space="preserve"> PAGEREF _Toc242131868 \h </w:instrText>
+        <w:instrText xml:space="preserve"> PAGEREF _Toc242132796 \h </w:instrText>
       </w:r>
       <w:r>
         <w:rPr>
@@ -526,7 +526,7 @@
         <w:rPr>
           <w:noProof/>
         </w:rPr>
-        <w:instrText xml:space="preserve"> PAGEREF _Toc242131869 \h </w:instrText>
+        <w:instrText xml:space="preserve"> PAGEREF _Toc242132797 \h </w:instrText>
       </w:r>
       <w:r>
         <w:rPr>
@@ -586,7 +586,7 @@
         <w:rPr>
           <w:noProof/>
         </w:rPr>
-        <w:instrText xml:space="preserve"> PAGEREF _Toc242131870 \h </w:instrText>
+        <w:instrText xml:space="preserve"> PAGEREF _Toc242132798 \h </w:instrText>
       </w:r>
       <w:r>
         <w:rPr>
@@ -646,7 +646,7 @@
         <w:rPr>
           <w:noProof/>
         </w:rPr>
-        <w:instrText xml:space="preserve"> PAGEREF _Toc242131871 \h </w:instrText>
+        <w:instrText xml:space="preserve"> PAGEREF _Toc242132799 \h </w:instrText>
       </w:r>
       <w:r>
         <w:rPr>
@@ -706,7 +706,7 @@
         <w:rPr>
           <w:noProof/>
         </w:rPr>
-        <w:instrText xml:space="preserve"> PAGEREF _Toc242131872 \h </w:instrText>
+        <w:instrText xml:space="preserve"> PAGEREF _Toc242132800 \h </w:instrText>
       </w:r>
       <w:r>
         <w:rPr>
@@ -766,7 +766,7 @@
         <w:rPr>
           <w:noProof/>
         </w:rPr>
-        <w:instrText xml:space="preserve"> PAGEREF _Toc242131873 \h </w:instrText>
+        <w:instrText xml:space="preserve"> PAGEREF _Toc242132801 \h </w:instrText>
       </w:r>
       <w:r>
         <w:rPr>
@@ -826,7 +826,7 @@
         <w:rPr>
           <w:noProof/>
         </w:rPr>
-        <w:instrText xml:space="preserve"> PAGEREF _Toc242131874 \h </w:instrText>
+        <w:instrText xml:space="preserve"> PAGEREF _Toc242132802 \h </w:instrText>
       </w:r>
       <w:r>
         <w:rPr>
@@ -886,7 +886,7 @@
         <w:rPr>
           <w:noProof/>
         </w:rPr>
-        <w:instrText xml:space="preserve"> PAGEREF _Toc242131875 \h </w:instrText>
+        <w:instrText xml:space="preserve"> PAGEREF _Toc242132803 \h </w:instrText>
       </w:r>
       <w:r>
         <w:rPr>
@@ -946,7 +946,7 @@
         <w:rPr>
           <w:noProof/>
         </w:rPr>
-        <w:instrText xml:space="preserve"> PAGEREF _Toc242131876 \h </w:instrText>
+        <w:instrText xml:space="preserve"> PAGEREF _Toc242132804 \h </w:instrText>
       </w:r>
       <w:r>
         <w:rPr>
@@ -1006,7 +1006,7 @@
         <w:rPr>
           <w:noProof/>
         </w:rPr>
-        <w:instrText xml:space="preserve"> PAGEREF _Toc242131877 \h </w:instrText>
+        <w:instrText xml:space="preserve"> PAGEREF _Toc242132805 \h </w:instrText>
       </w:r>
       <w:r>
         <w:rPr>
@@ -1066,7 +1066,7 @@
         <w:rPr>
           <w:noProof/>
         </w:rPr>
-        <w:instrText xml:space="preserve"> PAGEREF _Toc242131878 \h </w:instrText>
+        <w:instrText xml:space="preserve"> PAGEREF _Toc242132806 \h </w:instrText>
       </w:r>
       <w:r>
         <w:rPr>
@@ -1126,7 +1126,7 @@
         <w:rPr>
           <w:noProof/>
         </w:rPr>
-        <w:instrText xml:space="preserve"> PAGEREF _Toc242131879 \h </w:instrText>
+        <w:instrText xml:space="preserve"> PAGEREF _Toc242132807 \h </w:instrText>
       </w:r>
       <w:r>
         <w:rPr>
@@ -1186,7 +1186,7 @@
         <w:rPr>
           <w:noProof/>
         </w:rPr>
-        <w:instrText xml:space="preserve"> PAGEREF _Toc242131880 \h </w:instrText>
+        <w:instrText xml:space="preserve"> PAGEREF _Toc242132808 \h </w:instrText>
       </w:r>
       <w:r>
         <w:rPr>
@@ -1246,7 +1246,7 @@
         <w:rPr>
           <w:noProof/>
         </w:rPr>
-        <w:instrText xml:space="preserve"> PAGEREF _Toc242131881 \h </w:instrText>
+        <w:instrText xml:space="preserve"> PAGEREF _Toc242132809 \h </w:instrText>
       </w:r>
       <w:r>
         <w:rPr>
@@ -1306,7 +1306,7 @@
         <w:rPr>
           <w:noProof/>
         </w:rPr>
-        <w:instrText xml:space="preserve"> PAGEREF _Toc242131882 \h </w:instrText>
+        <w:instrText xml:space="preserve"> PAGEREF _Toc242132810 \h </w:instrText>
       </w:r>
       <w:r>
         <w:rPr>
@@ -1366,7 +1366,7 @@
         <w:rPr>
           <w:noProof/>
         </w:rPr>
-        <w:instrText xml:space="preserve"> PAGEREF _Toc242131883 \h </w:instrText>
+        <w:instrText xml:space="preserve"> PAGEREF _Toc242132811 \h </w:instrText>
       </w:r>
       <w:r>
         <w:rPr>
@@ -1426,7 +1426,7 @@
         <w:rPr>
           <w:noProof/>
         </w:rPr>
-        <w:instrText xml:space="preserve"> PAGEREF _Toc242131884 \h </w:instrText>
+        <w:instrText xml:space="preserve"> PAGEREF _Toc242132812 \h </w:instrText>
       </w:r>
       <w:r>
         <w:rPr>
@@ -1486,7 +1486,7 @@
         <w:rPr>
           <w:noProof/>
         </w:rPr>
-        <w:instrText xml:space="preserve"> PAGEREF _Toc242131885 \h </w:instrText>
+        <w:instrText xml:space="preserve"> PAGEREF _Toc242132813 \h </w:instrText>
       </w:r>
       <w:r>
         <w:rPr>
@@ -1546,7 +1546,7 @@
         <w:rPr>
           <w:noProof/>
         </w:rPr>
-        <w:instrText xml:space="preserve"> PAGEREF _Toc242131886 \h </w:instrText>
+        <w:instrText xml:space="preserve"> PAGEREF _Toc242132814 \h </w:instrText>
       </w:r>
       <w:r>
         <w:rPr>
@@ -1606,7 +1606,7 @@
         <w:rPr>
           <w:noProof/>
         </w:rPr>
-        <w:instrText xml:space="preserve"> PAGEREF _Toc242131887 \h </w:instrText>
+        <w:instrText xml:space="preserve"> PAGEREF _Toc242132815 \h </w:instrText>
       </w:r>
       <w:r>
         <w:rPr>
@@ -1666,7 +1666,7 @@
         <w:rPr>
           <w:noProof/>
         </w:rPr>
-        <w:instrText xml:space="preserve"> PAGEREF _Toc242131888 \h </w:instrText>
+        <w:instrText xml:space="preserve"> PAGEREF _Toc242132816 \h </w:instrText>
       </w:r>
       <w:r>
         <w:rPr>
@@ -1726,7 +1726,7 @@
         <w:rPr>
           <w:noProof/>
         </w:rPr>
-        <w:instrText xml:space="preserve"> PAGEREF _Toc242131889 \h </w:instrText>
+        <w:instrText xml:space="preserve"> PAGEREF _Toc242132817 \h </w:instrText>
       </w:r>
       <w:r>
         <w:rPr>
@@ -1786,7 +1786,7 @@
         <w:rPr>
           <w:noProof/>
         </w:rPr>
-        <w:instrText xml:space="preserve"> PAGEREF _Toc242131890 \h </w:instrText>
+        <w:instrText xml:space="preserve"> PAGEREF _Toc242132818 \h </w:instrText>
       </w:r>
       <w:r>
         <w:rPr>
@@ -1846,7 +1846,7 @@
         <w:rPr>
           <w:noProof/>
         </w:rPr>
-        <w:instrText xml:space="preserve"> PAGEREF _Toc242131891 \h </w:instrText>
+        <w:instrText xml:space="preserve"> PAGEREF _Toc242132819 \h </w:instrText>
       </w:r>
       <w:r>
         <w:rPr>
@@ -1906,7 +1906,7 @@
         <w:rPr>
           <w:noProof/>
         </w:rPr>
-        <w:instrText xml:space="preserve"> PAGEREF _Toc242131892 \h </w:instrText>
+        <w:instrText xml:space="preserve"> PAGEREF _Toc242132820 \h </w:instrText>
       </w:r>
       <w:r>
         <w:rPr>
@@ -1966,7 +1966,7 @@
         <w:rPr>
           <w:noProof/>
         </w:rPr>
-        <w:instrText xml:space="preserve"> PAGEREF _Toc242131893 \h </w:instrText>
+        <w:instrText xml:space="preserve"> PAGEREF _Toc242132821 \h </w:instrText>
       </w:r>
       <w:r>
         <w:rPr>
@@ -2026,7 +2026,7 @@
         <w:rPr>
           <w:noProof/>
         </w:rPr>
-        <w:instrText xml:space="preserve"> PAGEREF _Toc242131894 \h </w:instrText>
+        <w:instrText xml:space="preserve"> PAGEREF _Toc242132822 \h </w:instrText>
       </w:r>
       <w:r>
         <w:rPr>
@@ -2086,7 +2086,7 @@
         <w:rPr>
           <w:noProof/>
         </w:rPr>
-        <w:instrText xml:space="preserve"> PAGEREF _Toc242131895 \h </w:instrText>
+        <w:instrText xml:space="preserve"> PAGEREF _Toc242132823 \h </w:instrText>
       </w:r>
       <w:r>
         <w:rPr>
@@ -2146,7 +2146,7 @@
         <w:rPr>
           <w:noProof/>
         </w:rPr>
-        <w:instrText xml:space="preserve"> PAGEREF _Toc242131896 \h </w:instrText>
+        <w:instrText xml:space="preserve"> PAGEREF _Toc242132824 \h </w:instrText>
       </w:r>
       <w:r>
         <w:rPr>
@@ -2207,7 +2207,7 @@
         <w:rPr>
           <w:noProof/>
         </w:rPr>
-        <w:instrText xml:space="preserve"> PAGEREF _Toc242131897 \h </w:instrText>
+        <w:instrText xml:space="preserve"> PAGEREF _Toc242132825 \h </w:instrText>
       </w:r>
       <w:r>
         <w:rPr>
@@ -2267,7 +2267,7 @@
         <w:rPr>
           <w:noProof/>
         </w:rPr>
-        <w:instrText xml:space="preserve"> PAGEREF _Toc242131898 \h </w:instrText>
+        <w:instrText xml:space="preserve"> PAGEREF _Toc242132826 \h </w:instrText>
       </w:r>
       <w:r>
         <w:rPr>
@@ -2327,7 +2327,7 @@
         <w:rPr>
           <w:noProof/>
         </w:rPr>
-        <w:instrText xml:space="preserve"> PAGEREF _Toc242131899 \h </w:instrText>
+        <w:instrText xml:space="preserve"> PAGEREF _Toc242132827 \h </w:instrText>
       </w:r>
       <w:r>
         <w:rPr>
@@ -2387,7 +2387,7 @@
         <w:rPr>
           <w:noProof/>
         </w:rPr>
-        <w:instrText xml:space="preserve"> PAGEREF _Toc242131900 \h </w:instrText>
+        <w:instrText xml:space="preserve"> PAGEREF _Toc242132828 \h </w:instrText>
       </w:r>
       <w:r>
         <w:rPr>
@@ -2447,7 +2447,7 @@
         <w:rPr>
           <w:noProof/>
         </w:rPr>
-        <w:instrText xml:space="preserve"> PAGEREF _Toc242131901 \h </w:instrText>
+        <w:instrText xml:space="preserve"> PAGEREF _Toc242132829 \h </w:instrText>
       </w:r>
       <w:r>
         <w:rPr>
@@ -2507,7 +2507,7 @@
         <w:rPr>
           <w:noProof/>
         </w:rPr>
-        <w:instrText xml:space="preserve"> PAGEREF _Toc242131902 \h </w:instrText>
+        <w:instrText xml:space="preserve"> PAGEREF _Toc242132830 \h </w:instrText>
       </w:r>
       <w:r>
         <w:rPr>
@@ -2567,7 +2567,7 @@
         <w:rPr>
           <w:noProof/>
         </w:rPr>
-        <w:instrText xml:space="preserve"> PAGEREF _Toc242131903 \h </w:instrText>
+        <w:instrText xml:space="preserve"> PAGEREF _Toc242132831 \h </w:instrText>
       </w:r>
       <w:r>
         <w:rPr>
@@ -2627,7 +2627,7 @@
         <w:rPr>
           <w:noProof/>
         </w:rPr>
-        <w:instrText xml:space="preserve"> PAGEREF _Toc242131904 \h </w:instrText>
+        <w:instrText xml:space="preserve"> PAGEREF _Toc242132832 \h </w:instrText>
       </w:r>
       <w:r>
         <w:rPr>
@@ -2687,7 +2687,7 @@
         <w:rPr>
           <w:noProof/>
         </w:rPr>
-        <w:instrText xml:space="preserve"> PAGEREF _Toc242131905 \h </w:instrText>
+        <w:instrText xml:space="preserve"> PAGEREF _Toc242132833 \h </w:instrText>
       </w:r>
       <w:r>
         <w:rPr>
@@ -2747,7 +2747,7 @@
         <w:rPr>
           <w:noProof/>
         </w:rPr>
-        <w:instrText xml:space="preserve"> PAGEREF _Toc242131906 \h </w:instrText>
+        <w:instrText xml:space="preserve"> PAGEREF _Toc242132834 \h </w:instrText>
       </w:r>
       <w:r>
         <w:rPr>
@@ -2807,7 +2807,7 @@
         <w:rPr>
           <w:noProof/>
         </w:rPr>
-        <w:instrText xml:space="preserve"> PAGEREF _Toc242131907 \h </w:instrText>
+        <w:instrText xml:space="preserve"> PAGEREF _Toc242132835 \h </w:instrText>
       </w:r>
       <w:r>
         <w:rPr>
@@ -2851,7 +2851,7 @@
         <w:pStyle w:val="Heading2"/>
         <w:spacing w:after="240" w:line="360" w:lineRule="auto"/>
       </w:pPr>
-      <w:bookmarkStart w:id="0" w:name="_Toc242131867"/>
+      <w:bookmarkStart w:id="0" w:name="_Toc242132795"/>
       <w:r>
         <w:lastRenderedPageBreak/>
         <w:t>LỜI CÁM ƠN</w:t>
@@ -2955,7 +2955,7 @@
         <w:pStyle w:val="Heading2"/>
         <w:spacing w:after="240" w:line="360" w:lineRule="auto"/>
       </w:pPr>
-      <w:bookmarkStart w:id="1" w:name="_Toc242131868"/>
+      <w:bookmarkStart w:id="1" w:name="_Toc242132796"/>
       <w:r>
         <w:lastRenderedPageBreak/>
         <w:t>TÓM TẮT</w:t>
@@ -2987,7 +2987,7 @@
         <w:pStyle w:val="Heading1"/>
         <w:pageBreakBefore/>
       </w:pPr>
-      <w:bookmarkStart w:id="2" w:name="_Toc242131869"/>
+      <w:bookmarkStart w:id="2" w:name="_Toc242132797"/>
       <w:r>
         <w:lastRenderedPageBreak/>
         <w:t>CHƯƠNG 1. ĐẶT VẤN ĐỀ VÀ MỤC TIÊU</w:t>
@@ -2999,7 +2999,7 @@
         <w:pStyle w:val="Heading2"/>
         <w:spacing w:after="240" w:line="360" w:lineRule="auto"/>
       </w:pPr>
-      <w:bookmarkStart w:id="3" w:name="_Toc242131870"/>
+      <w:bookmarkStart w:id="3" w:name="_Toc242132798"/>
       <w:r>
         <w:t>1.1. Bối cảnh kỹ thuật và ý nghĩa đề tài</w:t>
       </w:r>
@@ -3114,7 +3114,7 @@
         <w:pStyle w:val="Heading2"/>
         <w:spacing w:after="240" w:line="360" w:lineRule="auto"/>
       </w:pPr>
-      <w:bookmarkStart w:id="4" w:name="_Toc242131871"/>
+      <w:bookmarkStart w:id="4" w:name="_Toc242132799"/>
       <w:r>
         <w:t>1.2. Phát biểu bài toán và phạm vi nghiên cứu</w:t>
       </w:r>
@@ -3587,7 +3587,7 @@
         <w:pStyle w:val="Heading2"/>
         <w:spacing w:after="240" w:line="360" w:lineRule="auto"/>
       </w:pPr>
-      <w:bookmarkStart w:id="5" w:name="_Toc242131872"/>
+      <w:bookmarkStart w:id="5" w:name="_Toc242132800"/>
       <w:r>
         <w:t>1.3. Mục tiêu kỹ thuật và sản phẩm thực hiện</w:t>
       </w:r>
@@ -4041,7 +4041,7 @@
         <w:pStyle w:val="Heading1"/>
         <w:pageBreakBefore/>
       </w:pPr>
-      <w:bookmarkStart w:id="6" w:name="_Toc242131873"/>
+      <w:bookmarkStart w:id="6" w:name="_Toc242132801"/>
       <w:r>
         <w:lastRenderedPageBreak/>
         <w:t>CHƯƠNG 2. TẬP DỮ LIỆU VÀ TIỀN XỬ LÝ</w:t>
@@ -4053,7 +4053,7 @@
         <w:pStyle w:val="Heading2"/>
         <w:spacing w:after="240" w:line="360" w:lineRule="auto"/>
       </w:pPr>
-      <w:bookmarkStart w:id="7" w:name="_Toc242131874"/>
+      <w:bookmarkStart w:id="7" w:name="_Toc242132802"/>
       <w:r>
         <w:t>2.1. Đặc tả tập dữ liệu và nhãn tham chiếu</w:t>
       </w:r>
@@ -4167,7 +4167,7 @@
         <w:pStyle w:val="Heading2"/>
         <w:spacing w:after="240" w:line="360" w:lineRule="auto"/>
       </w:pPr>
-      <w:bookmarkStart w:id="8" w:name="_Toc242131875"/>
+      <w:bookmarkStart w:id="8" w:name="_Toc242132803"/>
       <w:r>
         <w:t>2.2. Quy trình căn nhãn, lọc và chuẩn hóa</w:t>
       </w:r>
@@ -4873,7 +4873,7 @@
         <w:pStyle w:val="Heading2"/>
         <w:spacing w:after="240" w:line="360" w:lineRule="auto"/>
       </w:pPr>
-      <w:bookmarkStart w:id="9" w:name="_Toc242131876"/>
+      <w:bookmarkStart w:id="9" w:name="_Toc242132804"/>
       <w:r>
         <w:t>2.3. Chia dữ liệu theo người và quản lý từng fold</w:t>
       </w:r>
@@ -5563,7 +5563,7 @@
         <w:pStyle w:val="Heading2"/>
         <w:spacing w:after="240" w:line="360" w:lineRule="auto"/>
       </w:pPr>
-      <w:bookmarkStart w:id="10" w:name="_Toc242131877"/>
+      <w:bookmarkStart w:id="10" w:name="_Toc242132805"/>
       <w:r>
         <w:lastRenderedPageBreak/>
         <w:t>2.4. Phân bố nhịp tim và đặc điểm chuyển động</w:t>
@@ -6120,7 +6120,7 @@
         <w:pStyle w:val="Heading1"/>
         <w:pageBreakBefore/>
       </w:pPr>
-      <w:bookmarkStart w:id="11" w:name="_Toc242131878"/>
+      <w:bookmarkStart w:id="11" w:name="_Toc242132806"/>
       <w:r>
         <w:lastRenderedPageBreak/>
         <w:t>CHƯƠNG 3. PHƯƠNG PHÁP ĐỀ XUẤT</w:t>
@@ -6132,7 +6132,7 @@
         <w:pStyle w:val="Heading2"/>
         <w:spacing w:after="240" w:line="360" w:lineRule="auto"/>
       </w:pPr>
-      <w:bookmarkStart w:id="12" w:name="_Toc242131879"/>
+      <w:bookmarkStart w:id="12" w:name="_Toc242132807"/>
       <w:r>
         <w:t>3.1. Kiến trúc 1D-cVAE và kích thước tensor</w:t>
       </w:r>
@@ -6247,7 +6247,7 @@
         <w:pStyle w:val="Heading2"/>
         <w:spacing w:after="240" w:line="360" w:lineRule="auto"/>
       </w:pPr>
-      <w:bookmarkStart w:id="13" w:name="_Toc242131880"/>
+      <w:bookmarkStart w:id="13" w:name="_Toc242132808"/>
       <w:r>
         <w:t>3.2. Mã hóa, tái tạo và sinh từ phân phối prior</w:t>
       </w:r>
@@ -6283,7 +6283,7 @@
         <w:pStyle w:val="Heading2"/>
         <w:spacing w:after="240" w:line="360" w:lineRule="auto"/>
       </w:pPr>
-      <w:bookmarkStart w:id="14" w:name="_Toc242131881"/>
+      <w:bookmarkStart w:id="14" w:name="_Toc242132809"/>
       <w:r>
         <w:t>3.3. Hàm mất mát và mạng HR phụ trợ</w:t>
       </w:r>
@@ -7045,7 +7045,7 @@
         <w:pStyle w:val="Heading2"/>
         <w:spacing w:after="240" w:line="360" w:lineRule="auto"/>
       </w:pPr>
-      <w:bookmarkStart w:id="15" w:name="_Toc242131882"/>
+      <w:bookmarkStart w:id="15" w:name="_Toc242132810"/>
       <w:r>
         <w:t>3.4. Bộ sinh đối chuẩn hai Gaussian</w:t>
       </w:r>
@@ -7653,7 +7653,7 @@
         <w:pStyle w:val="Heading1"/>
         <w:pageBreakBefore/>
       </w:pPr>
-      <w:bookmarkStart w:id="16" w:name="_Toc242131883"/>
+      <w:bookmarkStart w:id="16" w:name="_Toc242132811"/>
       <w:r>
         <w:lastRenderedPageBreak/>
         <w:t>CHƯƠNG 4. THIẾT KẾ THỰC NGHIỆM VÀ CHỈ SỐ</w:t>
@@ -7665,7 +7665,7 @@
         <w:pStyle w:val="Heading2"/>
         <w:spacing w:after="240" w:line="360" w:lineRule="auto"/>
       </w:pPr>
-      <w:bookmarkStart w:id="17" w:name="_Toc242131884"/>
+      <w:bookmarkStart w:id="17" w:name="_Toc242132812"/>
       <w:r>
         <w:t>4.1. Huấn luyện, chọn cấu hình và khả năng tái lập</w:t>
       </w:r>
@@ -7784,7 +7784,7 @@
         <w:pStyle w:val="Heading2"/>
         <w:spacing w:after="240" w:line="360" w:lineRule="auto"/>
       </w:pPr>
-      <w:bookmarkStart w:id="18" w:name="_Toc242131885"/>
+      <w:bookmarkStart w:id="18" w:name="_Toc242132813"/>
       <w:r>
         <w:lastRenderedPageBreak/>
         <w:t>4.2. Kiểm chuẩn bộ đo HR trên tín hiệu thực</w:t>
@@ -7899,7 +7899,7 @@
         <w:pStyle w:val="Heading2"/>
         <w:spacing w:after="240" w:line="360" w:lineRule="auto"/>
       </w:pPr>
-      <w:bookmarkStart w:id="19" w:name="_Toc242131886"/>
+      <w:bookmarkStart w:id="19" w:name="_Toc242132814"/>
       <w:r>
         <w:t>4.3. Định nghĩa chỉ số và quy tắc tổng hợp</w:t>
       </w:r>
@@ -8483,7 +8483,7 @@
         <w:pStyle w:val="Heading2"/>
         <w:spacing w:after="240" w:line="360" w:lineRule="auto"/>
       </w:pPr>
-      <w:bookmarkStart w:id="20" w:name="_Toc242131887"/>
+      <w:bookmarkStart w:id="20" w:name="_Toc242132815"/>
       <w:r>
         <w:t>4.4. Quy trình kiểm thử và phân tích bóc tách</w:t>
       </w:r>
@@ -9026,7 +9026,7 @@
         <w:pStyle w:val="Heading1"/>
         <w:pageBreakBefore/>
       </w:pPr>
-      <w:bookmarkStart w:id="21" w:name="_Toc242131888"/>
+      <w:bookmarkStart w:id="21" w:name="_Toc242132816"/>
       <w:r>
         <w:lastRenderedPageBreak/>
         <w:t>CHƯƠNG 5. KẾT QUẢ THỰC NGHIỆM VÀ THẢO LUẬN</w:t>
@@ -9038,7 +9038,7 @@
         <w:pStyle w:val="Heading2"/>
         <w:spacing w:after="240" w:line="360" w:lineRule="auto"/>
       </w:pPr>
-      <w:bookmarkStart w:id="22" w:name="_Toc242131889"/>
+      <w:bookmarkStart w:id="22" w:name="_Toc242132817"/>
       <w:r>
         <w:t>5.1. Kết quả sai số nhịp tim</w:t>
       </w:r>
@@ -9697,7 +9697,7 @@
         <w:pStyle w:val="Heading2"/>
         <w:spacing w:after="240" w:line="360" w:lineRule="auto"/>
       </w:pPr>
-      <w:bookmarkStart w:id="23" w:name="_Toc242131890"/>
+      <w:bookmarkStart w:id="23" w:name="_Toc242132818"/>
       <w:r>
         <w:t>5.2. Tỷ lệ đo được và tỷ lệ sai lệch không quá 3 bpm</w:t>
       </w:r>
@@ -9870,7 +9870,7 @@
         <w:pStyle w:val="Heading2"/>
         <w:spacing w:after="240" w:line="360" w:lineRule="auto"/>
       </w:pPr>
-      <w:bookmarkStart w:id="24" w:name="_Toc242131891"/>
+      <w:bookmarkStart w:id="24" w:name="_Toc242132819"/>
       <w:r>
         <w:t>5.3. Phân bố HR của các cửa sổ sinh</w:t>
       </w:r>
@@ -9980,7 +9980,7 @@
         <w:pStyle w:val="Heading2"/>
         <w:spacing w:after="240" w:line="360" w:lineRule="auto"/>
       </w:pPr>
-      <w:bookmarkStart w:id="25" w:name="_Toc242131892"/>
+      <w:bookmarkStart w:id="25" w:name="_Toc242132820"/>
       <w:r>
         <w:t>5.4. Minh họa dạng sóng và đáp ứng điều kiện</w:t>
       </w:r>
@@ -10090,7 +10090,7 @@
         <w:pStyle w:val="Heading2"/>
         <w:spacing w:after="240" w:line="360" w:lineRule="auto"/>
       </w:pPr>
-      <w:bookmarkStart w:id="26" w:name="_Toc242131893"/>
+      <w:bookmarkStart w:id="26" w:name="_Toc242132821"/>
       <w:r>
         <w:t>5.5. Tái tạo ghép cặp trên tập test</w:t>
       </w:r>
@@ -10200,7 +10200,7 @@
         <w:pStyle w:val="Heading2"/>
         <w:spacing w:after="240" w:line="360" w:lineRule="auto"/>
       </w:pPr>
-      <w:bookmarkStart w:id="27" w:name="_Toc242131894"/>
+      <w:bookmarkStart w:id="27" w:name="_Toc242132822"/>
       <w:r>
         <w:t>5.6. Sai số tái tạo theo fold và seed</w:t>
       </w:r>
@@ -10315,7 +10315,7 @@
         <w:pStyle w:val="Heading2"/>
         <w:spacing w:after="240" w:line="360" w:lineRule="auto"/>
       </w:pPr>
-      <w:bookmarkStart w:id="28" w:name="_Toc242131895"/>
+      <w:bookmarkStart w:id="28" w:name="_Toc242132823"/>
       <w:r>
         <w:t>5.7. Hình thái xung và đặc điểm biên độ</w:t>
       </w:r>
@@ -10425,7 +10425,7 @@
         <w:pStyle w:val="Heading2"/>
         <w:spacing w:after="240" w:line="360" w:lineRule="auto"/>
       </w:pPr>
-      <w:bookmarkStart w:id="29" w:name="_Toc242131896"/>
+      <w:bookmarkStart w:id="29" w:name="_Toc242132824"/>
       <w:r>
         <w:t>5.8. Độ đa dạng sau căn nhịp</w:t>
       </w:r>
@@ -10540,7 +10540,7 @@
         <w:pStyle w:val="Heading2"/>
         <w:spacing w:after="240" w:line="360" w:lineRule="auto"/>
       </w:pPr>
-      <w:bookmarkStart w:id="30" w:name="_Toc242131897"/>
+      <w:bookmarkStart w:id="30" w:name="_Toc242132825"/>
       <w:r>
         <w:t>5.9. Kết quả bóc tách thành phần</w:t>
       </w:r>
@@ -10655,7 +10655,7 @@
         <w:pStyle w:val="Heading2"/>
         <w:spacing w:after="240" w:line="360" w:lineRule="auto"/>
       </w:pPr>
-      <w:bookmarkStart w:id="31" w:name="_Toc242131898"/>
+      <w:bookmarkStart w:id="31" w:name="_Toc242132826"/>
       <w:r>
         <w:t>5.10. Kích thước và thời gian suy luận trên CPU</w:t>
       </w:r>
@@ -11114,7 +11114,7 @@
         <w:pStyle w:val="Heading1"/>
         <w:pageBreakBefore/>
       </w:pPr>
-      <w:bookmarkStart w:id="32" w:name="_Toc242131899"/>
+      <w:bookmarkStart w:id="32" w:name="_Toc242132827"/>
       <w:r>
         <w:lastRenderedPageBreak/>
         <w:t>CHƯƠNG 6. TRIỂN KHAI VÀ TRÌNH DIỄN</w:t>
@@ -11126,7 +11126,7 @@
         <w:pStyle w:val="Heading2"/>
         <w:spacing w:after="240" w:line="360" w:lineRule="auto"/>
       </w:pPr>
-      <w:bookmarkStart w:id="33" w:name="_Toc242131900"/>
+      <w:bookmarkStart w:id="33" w:name="_Toc242132828"/>
       <w:r>
         <w:t>6.1. Tổ chức chương trình sinh và kiến trúc web</w:t>
       </w:r>
@@ -11240,7 +11240,7 @@
         <w:pStyle w:val="Heading2"/>
         <w:spacing w:after="240" w:line="360" w:lineRule="auto"/>
       </w:pPr>
-      <w:bookmarkStart w:id="34" w:name="_Toc242131901"/>
+      <w:bookmarkStart w:id="34" w:name="_Toc242132829"/>
       <w:r>
         <w:lastRenderedPageBreak/>
         <w:t>6.2. Chức năng giao diện và quy trình sử dụng</w:t>
@@ -11769,7 +11769,7 @@
         <w:pStyle w:val="Heading2"/>
         <w:spacing w:after="240" w:line="360" w:lineRule="auto"/>
       </w:pPr>
-      <w:bookmarkStart w:id="35" w:name="_Toc242131902"/>
+      <w:bookmarkStart w:id="35" w:name="_Toc242132830"/>
       <w:r>
         <w:t>6.3. Kết quả trình diễn và đối chiếu hai phương pháp</w:t>
       </w:r>
@@ -11876,7 +11876,7 @@
         <w:pStyle w:val="Heading2"/>
         <w:spacing w:after="240" w:line="360" w:lineRule="auto"/>
       </w:pPr>
-      <w:bookmarkStart w:id="36" w:name="_Toc242131903"/>
+      <w:bookmarkStart w:id="36" w:name="_Toc242132831"/>
       <w:r>
         <w:t>6.4. Kiểm thử ứng dụng và xuất dữ liệu</w:t>
       </w:r>
@@ -11907,7 +11907,7 @@
         <w:pStyle w:val="Heading1"/>
         <w:pageBreakBefore/>
       </w:pPr>
-      <w:bookmarkStart w:id="37" w:name="_Toc242131904"/>
+      <w:bookmarkStart w:id="37" w:name="_Toc242132832"/>
       <w:r>
         <w:lastRenderedPageBreak/>
         <w:t>CHƯƠNG 7. KẾT LUẬN VÀ ĐỊNH HƯỚNG PHÁT TRIỂN</w:t>
@@ -11919,7 +11919,7 @@
         <w:pStyle w:val="Heading2"/>
         <w:spacing w:after="240" w:line="360" w:lineRule="auto"/>
       </w:pPr>
-      <w:bookmarkStart w:id="38" w:name="_Toc242131905"/>
+      <w:bookmarkStart w:id="38" w:name="_Toc242132833"/>
       <w:r>
         <w:t>7.1. Kết quả thực hiện và sản phẩm bàn giao</w:t>
       </w:r>
@@ -12133,7 +12133,7 @@
         <w:pStyle w:val="Heading2"/>
         <w:spacing w:after="240" w:line="360" w:lineRule="auto"/>
       </w:pPr>
-      <w:bookmarkStart w:id="39" w:name="_Toc242131906"/>
+      <w:bookmarkStart w:id="39" w:name="_Toc242132834"/>
       <w:r>
         <w:t>7.2. Định hướng phát triển và hoàn thiện ứng dụng</w:t>
       </w:r>
@@ -12165,7 +12165,7 @@
         <w:pStyle w:val="Heading2"/>
         <w:spacing w:after="240" w:line="360" w:lineRule="auto"/>
       </w:pPr>
-      <w:bookmarkStart w:id="40" w:name="_Toc242131907"/>
+      <w:bookmarkStart w:id="40" w:name="_Toc242132835"/>
       <w:r>
         <w:t>TÀI LIỆU THAM KHẢO</w:t>
       </w:r>

</xml_diff>